<commit_message>
Generate completed Word report from verified findings
</commit_message>
<xml_diff>
--- a/docs/Informe.docx
+++ b/docs/Informe.docx
@@ -1,2039 +1,265 @@
 
 <file path=word/document.xml><?xml version="1.0" encoding="utf-8"?>
-<w:document xmlns:wpc="http://schemas.microsoft.com/office/word/2010/wordprocessingCanvas" xmlns:cx="http://schemas.microsoft.com/office/drawing/2014/chartex" xmlns:cx1="http://schemas.microsoft.com/office/drawing/2015/9/8/chartex" xmlns:cx2="http://schemas.microsoft.com/office/drawing/2015/10/21/chartex" xmlns:cx3="http://schemas.microsoft.com/office/drawing/2016/5/9/chartex" xmlns:cx4="http://schemas.microsoft.com/office/drawing/2016/5/10/chartex" xmlns:cx5="http://schemas.microsoft.com/office/drawing/2016/5/11/chartex" xmlns:cx6="http://schemas.microsoft.com/office/drawing/2016/5/12/chartex" xmlns:cx7="http://schemas.microsoft.com/office/drawing/2016/5/13/chartex" xmlns:cx8="http://schemas.microsoft.com/office/drawing/2016/5/14/chartex" xmlns:mc="http://schemas.openxmlformats.org/markup-compatibility/2006" xmlns:aink="http://schemas.microsoft.com/office/drawing/2016/ink" xmlns:am3d="http://schemas.microsoft.com/office/drawing/2017/model3d" xmlns:o="urn:schemas-microsoft-com:office:office" xmlns:oel="http://schemas.microsoft.com/office/2019/extlst" xmlns:r="http://schemas.openxmlformats.org/officeDocument/2006/relationships" xmlns:m="http://schemas.openxmlformats.org/officeDocument/2006/math" xmlns:v="urn:schemas-microsoft-com:vml" xmlns:wp14="http://schemas.microsoft.com/office/word/2010/wordprocessingDrawing" xmlns:wp="http://schemas.openxmlformats.org/drawingml/2006/wordprocessingDrawing" xmlns:w10="urn:schemas-microsoft-com:office:word" xmlns:w="http://schemas.openxmlformats.org/wordprocessingml/2006/main" xmlns:w14="http://schemas.microsoft.com/office/word/2010/wordml" xmlns:w15="http://schemas.microsoft.com/office/word/2012/wordml" xmlns:w16cex="http://schemas.microsoft.com/office/word/2018/wordml/cex" xmlns:w16cid="http://schemas.microsoft.com/office/word/2016/wordml/cid" xmlns:w16="http://schemas.microsoft.com/office/word/2018/wordml" xmlns:w16du="http://schemas.microsoft.com/office/word/2023/wordml/word16du" xmlns:w16sdtdh="http://schemas.microsoft.com/office/word/2020/wordml/sdtdatahash" xmlns:w16sdtfl="http://schemas.microsoft.com/office/word/2024/wordml/sdtformatlock" xmlns:w16se="http://schemas.microsoft.com/office/word/2015/wordml/symex" xmlns:wpg="http://schemas.microsoft.com/office/word/2010/wordprocessingGroup" xmlns:wpi="http://schemas.microsoft.com/office/word/2010/wordprocessingInk" xmlns:wne="http://schemas.microsoft.com/office/word/2006/wordml" xmlns:wps="http://schemas.microsoft.com/office/word/2010/wordprocessingShape" xmlns:a="http://schemas.openxmlformats.org/drawingml/2006/main" xmlns:pic="http://schemas.openxmlformats.org/drawingml/2006/picture" xmlns:a14="http://schemas.microsoft.com/office/drawing/2010/main" mc:Ignorable="w14 w15 w16se w16cid w16 w16cex w16sdtdh w16sdtfl w16du wp14">
+<w:document xmlns:w="http://schemas.openxmlformats.org/wordprocessingml/2006/main">
   <w:body>
     <w:p>
-      <w:pPr>
-        <w:pStyle w:val="Title"/>
-        <w:rPr>
-          <w:lang w:val="es-CR"/>
-        </w:rPr>
-      </w:pPr>
       <w:r>
-        <w:rPr>
-          <w:lang w:val="es-CR"/>
-        </w:rPr>
-        <w:t>Trabajo en Clase — Programación Avanzada</w:t>
-      </w:r>
-    </w:p>
-    <w:p>
-      <w:pPr>
-        <w:pStyle w:val="Heading1"/>
-        <w:rPr>
-          <w:lang w:val="es-CR"/>
-        </w:rPr>
-      </w:pPr>
-      <w:r>
-        <w:rPr>
-          <w:lang w:val="es-CR"/>
-        </w:rPr>
-        <w:t>Mastermind con IA y Pruebas Unitarias (Versión V2 Completa)</w:t>
-      </w:r>
-    </w:p>
-    <w:p>
-      <w:pPr/>
-      <w:r>
-        <w:rPr>
-          <w:lang w:val="es-CR"/>
-        </w:rPr>
-        <w:t>PORTADA</w:t>
-      </w:r>
-      <w:r>
-        <w:br/>
-      </w:r>
-      <w:r>
-        <w:rPr>
-          <w:lang w:val="es-CR"/>
-        </w:rPr>
-        <w:t xml:space="preserve">Nombre del </w:t>
-      </w:r>
-      <w:r>
-        <w:rPr>
-          <w:lang w:val="es-CR"/>
-        </w:rPr>
-        <w:t>estudiante: _</w:t>
-      </w:r>
-      <w:r>
-        <w:rPr>
-          <w:lang w:val="es-CR"/>
-        </w:rPr>
-        <w:t>___________________________________</w:t>
-      </w:r>
-    </w:p>
-    <w:p>
-      <w:pPr/>
-      <w:r>
-        <w:rPr/>
-        <w:t>Vínculo</w:t>
-      </w:r>
-      <w:r>
-        <w:rPr/>
-        <w:t xml:space="preserve"> de </w:t>
-      </w:r>
-      <w:r>
-        <w:rPr/>
-        <w:t>github</w:t>
-      </w:r>
-      <w:r>
-        <w:rPr/>
-        <w:t>:  _______________________________________</w:t>
-      </w:r>
-    </w:p>
-    <w:p>
-      <w:pPr/>
-      <w:r>
-        <w:br/>
-      </w:r>
-      <w:r>
-        <w:rPr>
-          <w:lang w:val="es-CR"/>
-        </w:rPr>
-        <w:t>Asignatura: BSI-19 – Programación Avanzada - Sábado</w:t>
-      </w:r>
-      <w:r>
-        <w:br/>
-      </w:r>
-      <w:r>
-        <w:rPr>
-          <w:lang w:val="es-CR"/>
-        </w:rPr>
-        <w:t xml:space="preserve">Profesor: </w:t>
-      </w:r>
-      <w:r>
-        <w:rPr>
-          <w:lang w:val="es-CR"/>
-        </w:rPr>
-        <w:t>MSc</w:t>
-      </w:r>
-      <w:r>
-        <w:rPr>
-          <w:lang w:val="es-CR"/>
-        </w:rPr>
-        <w:t>. Héctor Egérico Fernández Méndez</w:t>
-      </w:r>
-      <w:r>
-        <w:br/>
-      </w:r>
-      <w:r>
-        <w:rPr>
-          <w:lang w:val="es-CR"/>
-        </w:rPr>
-        <w:t xml:space="preserve">Título: Evaluador </w:t>
-      </w:r>
-      <w:r>
-        <w:rPr>
-          <w:lang w:val="es-CR"/>
-        </w:rPr>
-        <w:t>Mastermind</w:t>
-      </w:r>
-      <w:r>
-        <w:rPr>
-          <w:lang w:val="es-CR"/>
-        </w:rPr>
-        <w:t xml:space="preserve"> con </w:t>
-      </w:r>
-      <w:r>
-        <w:rPr>
-          <w:lang w:val="es-CR"/>
-        </w:rPr>
-        <w:t>Cheat</w:t>
-      </w:r>
-      <w:r>
-        <w:rPr>
-          <w:lang w:val="es-CR"/>
-        </w:rPr>
-        <w:t xml:space="preserve"> Code I</w:t>
-      </w:r>
-      <w:r>
-        <w:rPr>
-          <w:lang w:val="es-CR"/>
-        </w:rPr>
-        <w:t>ntegrado</w:t>
-      </w:r>
-    </w:p>
-    <w:p>
-      <w:pPr/>
-    </w:p>
-    <w:p>
-      <w:pPr>
-        <w:rPr>
-          <w:lang w:val="es-CR"/>
-        </w:rPr>
-      </w:pPr>
-      <w:r>
-        <w:br/>
-      </w:r>
-    </w:p>
-    <w:p>
-      <w:pPr>
-        <w:rPr>
-          <w:lang w:val="es-CR"/>
-        </w:rPr>
-      </w:pPr>
-      <w:r>
-        <w:rPr>
-          <w:lang w:val="es-CR"/>
-        </w:rPr>
-        <w:t>FLUJO DE TRABAJO EN GIT</w:t>
-      </w:r>
-      <w:r>
-        <w:rPr>
-          <w:lang w:val="es-CR"/>
-        </w:rPr>
-        <w:br/>
-      </w:r>
-      <w:r>
-        <w:rPr>
-          <w:lang w:val="es-CR"/>
-        </w:rPr>
-        <w:t>1. Implementar algoritmo básico → commit</w:t>
-      </w:r>
-      <w:r>
-        <w:rPr>
-          <w:lang w:val="es-CR"/>
-        </w:rPr>
-        <w:br/>
-      </w:r>
-      <w:r>
-        <w:rPr>
-          <w:lang w:val="es-CR"/>
-        </w:rPr>
-        <w:t>2. Crear pruebas unitarias → commit</w:t>
-      </w:r>
-      <w:r>
-        <w:rPr>
-          <w:lang w:val="es-CR"/>
-        </w:rPr>
-        <w:br/>
-      </w:r>
-      <w:r>
-        <w:rPr>
-          <w:lang w:val="es-CR"/>
-        </w:rPr>
-        <w:t>3. Agregar requisitos avanzados → commit</w:t>
-      </w:r>
-      <w:r>
-        <w:rPr>
-          <w:lang w:val="es-CR"/>
-        </w:rPr>
-        <w:br/>
-      </w:r>
-      <w:r>
-        <w:rPr>
-          <w:lang w:val="es-CR"/>
-        </w:rPr>
-        <w:t>4. Actualizar pruebas unitarias → commit</w:t>
-      </w:r>
-      <w:r>
-        <w:rPr>
-          <w:lang w:val="es-CR"/>
-        </w:rPr>
-        <w:br/>
-      </w:r>
-      <w:r>
-        <w:rPr>
-          <w:lang w:val="es-CR"/>
-        </w:rPr>
-        <w:t>5. Push final</w:t>
-      </w:r>
-      <w:r>
-        <w:rPr>
-          <w:lang w:val="es-CR"/>
-        </w:rPr>
-        <w:br/>
-      </w:r>
-    </w:p>
-    <w:p>
-      <w:pPr>
-        <w:rPr>
-          <w:lang w:val="es-CR"/>
-        </w:rPr>
-      </w:pPr>
-      <w:r>
-        <w:rPr>
-          <w:lang w:val="es-CR"/>
-        </w:rPr>
-        <w:t>ALGORITMO BÁSICO</w:t>
-      </w:r>
-      <w:r>
-        <w:rPr>
-          <w:lang w:val="es-CR"/>
-        </w:rPr>
-        <w:br/>
-      </w:r>
-      <w:r>
-        <w:rPr>
-          <w:lang w:val="es-CR"/>
-        </w:rPr>
-        <w:t>Función EvaluarIntento:</w:t>
-      </w:r>
-    </w:p>
-    <w:p>
-      <w:pPr>
-        <w:spacing w:line="300" w:lineRule="auto"/>
-        <w:rPr>
-          <w:lang w:val="es-CR"/>
-        </w:rPr>
-      </w:pPr>
-      <w:r>
-        <w:rPr>
-          <w:rFonts w:ascii="Segoe UI" w:hAnsi="Segoe UI" w:eastAsia="Segoe UI" w:cs="Segoe UI"/>
-          <w:sz w:val="21"/>
-          <w:szCs w:val="21"/>
-          <w:lang w:val="es-CR"/>
-        </w:rPr>
-        <w:t>EvaluarIntento(string patronSecreto, string intentoJugador</w:t>
-      </w:r>
-      <w:r>
-        <w:rPr>
-          <w:rFonts w:ascii="Segoe UI" w:hAnsi="Segoe UI" w:eastAsia="Segoe UI" w:cs="Segoe UI"/>
-          <w:sz w:val="21"/>
-          <w:szCs w:val="21"/>
-          <w:lang w:val="es-ES"/>
-        </w:rPr>
-        <w:t>)</w:t>
-      </w:r>
-    </w:p>
-    <w:p>
-      <w:pPr>
-        <w:spacing w:line="300" w:lineRule="auto"/>
-        <w:rPr>
-          <w:lang w:val="es-CR"/>
-        </w:rPr>
-      </w:pPr>
-      <w:r>
-        <w:rPr>
-          <w:lang w:val="es-ES"/>
-        </w:rPr>
-        <w:t>Entrada: patronSecreto, intentoJugador</w:t>
-      </w:r>
-      <w:r>
-        <w:br/>
-      </w:r>
-      <w:r>
-        <w:rPr>
-          <w:lang w:val="es-ES"/>
-        </w:rPr>
-        <w:t>Salida: bienPosicionados, colorCorrecto</w:t>
-      </w:r>
-    </w:p>
-    <w:p>
-      <w:pPr>
-        <w:spacing w:line="300" w:lineRule="auto"/>
-        <w:rPr>
-          <w:lang w:val="es-CR"/>
-        </w:rPr>
-      </w:pPr>
-      <w:r>
-        <w:br/>
-      </w:r>
-      <w:r>
-        <w:rPr>
-          <w:lang w:val="es-ES"/>
-        </w:rPr>
-        <w:t xml:space="preserve">Ejemplo: RGBY vs RBYG → </w:t>
-      </w:r>
-      <w:r>
-        <w:rPr>
-          <w:lang w:val="es-ES"/>
-        </w:rPr>
-        <w:t>bienPosicionados</w:t>
-      </w:r>
-      <w:r>
-        <w:rPr>
-          <w:lang w:val="es-ES"/>
-        </w:rPr>
-        <w:t xml:space="preserve">=1, </w:t>
-      </w:r>
-      <w:r>
-        <w:rPr>
-          <w:lang w:val="es-ES"/>
-        </w:rPr>
-        <w:t>colorCorrecto</w:t>
-      </w:r>
-      <w:r>
-        <w:rPr>
-          <w:lang w:val="es-ES"/>
-        </w:rPr>
-        <w:t>=3</w:t>
-      </w:r>
-      <w:r>
-        <w:br/>
-      </w:r>
-      <w:r>
-        <w:rPr>
-          <w:rFonts w:ascii="Segoe UI" w:hAnsi="Segoe UI" w:eastAsia="Segoe UI" w:cs="Segoe UI"/>
-          <w:sz w:val="21"/>
-          <w:szCs w:val="21"/>
-          <w:lang w:val="es-ES"/>
-        </w:rPr>
-        <w:t>bienPosicionados</w:t>
-      </w:r>
-      <w:r>
-        <w:rPr>
-          <w:rFonts w:ascii="Segoe UI" w:hAnsi="Segoe UI" w:eastAsia="Segoe UI" w:cs="Segoe UI"/>
-          <w:sz w:val="21"/>
-          <w:szCs w:val="21"/>
-          <w:lang w:val="es-ES"/>
-        </w:rPr>
-        <w:t xml:space="preserve"> = x [R]</w:t>
-      </w:r>
-    </w:p>
-    <w:p>
-      <w:pPr>
-        <w:spacing w:line="300" w:lineRule="auto"/>
-        <w:rPr>
-          <w:lang w:val="es-CR"/>
-        </w:rPr>
-      </w:pPr>
-      <w:r>
-        <w:rPr>
-          <w:rFonts w:ascii="Segoe UI" w:hAnsi="Segoe UI" w:eastAsia="Segoe UI" w:cs="Segoe UI"/>
-          <w:sz w:val="21"/>
-          <w:szCs w:val="21"/>
-          <w:lang w:val="es-ES"/>
-        </w:rPr>
-        <w:t>colorCorrecto = y [BYG]</w:t>
-      </w:r>
-    </w:p>
-    <w:p>
-      <w:pPr>
-        <w:rPr>
-          <w:lang w:val="es-CR"/>
-        </w:rPr>
-      </w:pPr>
-      <w:r>
-        <w:rPr>
-          <w:lang w:val="es-CR"/>
-        </w:rPr>
-        <w:t>REGLAS DEL ALGORITMO</w:t>
-      </w:r>
-      <w:r>
-        <w:rPr>
-          <w:lang w:val="es-CR"/>
-        </w:rPr>
-        <w:br/>
-      </w:r>
-      <w:r>
-        <w:rPr>
-          <w:lang w:val="es-CR"/>
-        </w:rPr>
-        <w:t>- Contar primero coincidencias exactas</w:t>
-      </w:r>
-      <w:r>
-        <w:rPr>
-          <w:lang w:val="es-CR"/>
-        </w:rPr>
-        <w:br/>
-      </w:r>
-      <w:r>
-        <w:rPr>
-          <w:lang w:val="es-CR"/>
-        </w:rPr>
-        <w:t>- Luego colores correctos en posición incorrecta</w:t>
-      </w:r>
-      <w:r>
-        <w:rPr>
-          <w:lang w:val="es-CR"/>
-        </w:rPr>
-        <w:br/>
-      </w:r>
-      <w:r>
-        <w:rPr>
-          <w:lang w:val="es-CR"/>
-        </w:rPr>
-        <w:t>- Evitar doble conteo</w:t>
-      </w:r>
-      <w:r>
-        <w:rPr>
-          <w:lang w:val="es-CR"/>
-        </w:rPr>
-        <w:br/>
+        <w:t xml:space="preserve"># Trabajo en Clase — Mastermind con pruebas unitarias</w:t>
       </w:r>
     </w:p>
     <w:p>
       <w:r>
-        <w:t>REQUISITOS AVANZADOS</w:t>
-      </w:r>
-      <w:r>
-        <w:br/>
-      </w:r>
-      <w:r>
-        <w:t>- Logging con fecha</w:t>
+        <w:t xml:space="preserve"/>
       </w:r>
     </w:p>
     <w:p>
-      <w:pPr>
-        <w:pStyle w:val="ListParagraph"/>
-        <w:numPr>
-          <w:ilvl w:val="0"/>
-          <w:numId w:val="2"/>
-        </w:numPr>
-        <w:rPr/>
-      </w:pPr>
       <w:r>
-        <w:rPr>
-          <w:rFonts w:ascii="Segoe UI" w:hAnsi="Segoe UI" w:eastAsia="Segoe UI" w:cs="Segoe UI"/>
-          <w:sz w:val="21"/>
-          <w:szCs w:val="21"/>
-          <w:lang w:val="es-ES"/>
-        </w:rPr>
-        <w:t xml:space="preserve">"En la fecha </w:t>
-      </w:r>
-      <w:r>
-        <w:rPr>
-          <w:rFonts w:ascii="Segoe UI" w:hAnsi="Segoe UI" w:eastAsia="Segoe UI" w:cs="Segoe UI"/>
-          <w:sz w:val="21"/>
-          <w:szCs w:val="21"/>
-          <w:lang w:val="es-ES"/>
-        </w:rPr>
-        <w:t>dd</w:t>
-      </w:r>
-      <w:r>
-        <w:rPr>
-          <w:rFonts w:ascii="Segoe UI" w:hAnsi="Segoe UI" w:eastAsia="Segoe UI" w:cs="Segoe UI"/>
-          <w:sz w:val="21"/>
-          <w:szCs w:val="21"/>
-          <w:lang w:val="es-ES"/>
-        </w:rPr>
-        <w:t>-mm-</w:t>
-      </w:r>
-      <w:r>
-        <w:rPr>
-          <w:rFonts w:ascii="Segoe UI" w:hAnsi="Segoe UI" w:eastAsia="Segoe UI" w:cs="Segoe UI"/>
-          <w:sz w:val="21"/>
-          <w:szCs w:val="21"/>
-          <w:lang w:val="es-ES"/>
-        </w:rPr>
-        <w:t>yyyy</w:t>
-      </w:r>
-      <w:r>
-        <w:rPr>
-          <w:rFonts w:ascii="Segoe UI" w:hAnsi="Segoe UI" w:eastAsia="Segoe UI" w:cs="Segoe UI"/>
-          <w:sz w:val="21"/>
-          <w:szCs w:val="21"/>
-          <w:lang w:val="es-ES"/>
-        </w:rPr>
-        <w:t xml:space="preserve"> </w:t>
-      </w:r>
-      <w:r>
-        <w:rPr>
-          <w:rFonts w:ascii="Segoe UI" w:hAnsi="Segoe UI" w:eastAsia="Segoe UI" w:cs="Segoe UI"/>
-          <w:sz w:val="21"/>
-          <w:szCs w:val="21"/>
-          <w:lang w:val="es-ES"/>
-        </w:rPr>
-        <w:t>hh:mm:ss</w:t>
-      </w:r>
-      <w:r>
-        <w:rPr>
-          <w:rFonts w:ascii="Segoe UI" w:hAnsi="Segoe UI" w:eastAsia="Segoe UI" w:cs="Segoe UI"/>
-          <w:sz w:val="21"/>
-          <w:szCs w:val="21"/>
-          <w:lang w:val="es-ES"/>
-        </w:rPr>
-        <w:t xml:space="preserve"> se evaluó el intento XXXX contra el patrón YYYY. Resultado: x bien posicionados</w:t>
-      </w:r>
-      <w:r>
-        <w:rPr>
-          <w:rFonts w:ascii="Segoe UI" w:hAnsi="Segoe UI" w:eastAsia="Segoe UI" w:cs="Segoe UI"/>
-          <w:sz w:val="21"/>
-          <w:szCs w:val="21"/>
-          <w:lang w:val="es-ES"/>
-        </w:rPr>
-        <w:t xml:space="preserve"> – z </w:t>
-      </w:r>
-      <w:r>
-        <w:rPr>
-          <w:rFonts w:ascii="Segoe UI" w:hAnsi="Segoe UI" w:eastAsia="Segoe UI" w:cs="Segoe UI"/>
-          <w:sz w:val="21"/>
-          <w:szCs w:val="21"/>
-          <w:lang w:val="es-ES"/>
-        </w:rPr>
-        <w:t>con color correcto."</w:t>
+        <w:t xml:space="preserve">Nombre del estudiante: PENDIENTE DE COMPLETAR.</w:t>
       </w:r>
     </w:p>
     <w:p>
-      <w:pPr>
-        <w:pStyle w:val="ListParagraph"/>
-        <w:numPr>
-          <w:ilvl w:val="0"/>
-          <w:numId w:val="1"/>
-        </w:numPr>
-        <w:rPr>
-          <w:lang w:val="es-CR"/>
-        </w:rPr>
-      </w:pPr>
       <w:r>
-        <w:rPr>
-          <w:lang w:val="es-CR"/>
-        </w:rPr>
-        <w:t>Validación de entradas</w:t>
-      </w:r>
-      <w:r>
-        <w:rPr>
-          <w:lang w:val="es-CR"/>
-        </w:rPr>
-        <w:t xml:space="preserve"> – escenarios de error</w:t>
+        <w:t xml:space="preserve"/>
       </w:r>
     </w:p>
     <w:p>
-      <w:pPr>
-        <w:pStyle w:val="ListParagraph"/>
-        <w:numPr>
-          <w:ilvl w:val="1"/>
-          <w:numId w:val="1"/>
-        </w:numPr>
-        <w:rPr>
-          <w:lang w:val="es-CR"/>
-        </w:rPr>
-      </w:pPr>
       <w:r>
-        <w:rPr>
-          <w:lang w:val="es-CR"/>
-        </w:rPr>
-        <w:t>Colores válidos (usted los define pueden ser numéricos hexadecimales)</w:t>
+        <w:t xml:space="preserve">Repositorio: https://github.com/AndrewShot01/Mastermind</w:t>
       </w:r>
     </w:p>
     <w:p>
-      <w:pPr>
-        <w:pStyle w:val="ListParagraph"/>
-        <w:numPr>
-          <w:ilvl w:val="2"/>
-          <w:numId w:val="1"/>
-        </w:numPr>
-      </w:pPr>
       <w:r>
-        <w:t>1 - Yellow</w:t>
+        <w:t xml:space="preserve"/>
       </w:r>
     </w:p>
     <w:p>
-      <w:pPr>
-        <w:pStyle w:val="ListParagraph"/>
-        <w:numPr>
-          <w:ilvl w:val="2"/>
-          <w:numId w:val="1"/>
-        </w:numPr>
-      </w:pPr>
       <w:r>
-        <w:t>Cyan</w:t>
+        <w:t xml:space="preserve">Asignatura: BSI-19 – Programación Avanzada - Sábado.</w:t>
       </w:r>
     </w:p>
     <w:p>
-      <w:pPr>
-        <w:pStyle w:val="ListParagraph"/>
-        <w:numPr>
-          <w:ilvl w:val="2"/>
-          <w:numId w:val="1"/>
-        </w:numPr>
-      </w:pPr>
       <w:r>
-        <w:t>Black</w:t>
+        <w:t xml:space="preserve"/>
       </w:r>
     </w:p>
     <w:p>
-      <w:pPr>
-        <w:pStyle w:val="ListParagraph"/>
-        <w:numPr>
-          <w:ilvl w:val="2"/>
-          <w:numId w:val="1"/>
-        </w:numPr>
-      </w:pPr>
       <w:r>
-        <w:t>Purple</w:t>
+        <w:t xml:space="preserve">Profesor: MSc. Héctor Egérico Fernández Méndez.</w:t>
       </w:r>
     </w:p>
     <w:p>
-      <w:pPr>
-        <w:pStyle w:val="ListParagraph"/>
-        <w:numPr>
-          <w:ilvl w:val="2"/>
-          <w:numId w:val="1"/>
-        </w:numPr>
-      </w:pPr>
       <w:r>
-        <w:t>White</w:t>
+        <w:t xml:space="preserve"/>
       </w:r>
     </w:p>
     <w:p>
-      <w:pPr>
-        <w:pStyle w:val="ListParagraph"/>
-        <w:numPr>
-          <w:ilvl w:val="2"/>
-          <w:numId w:val="1"/>
-        </w:numPr>
-      </w:pPr>
       <w:r>
-        <w:t>Pink</w:t>
+        <w:t xml:space="preserve">Título: Evaluador Mastermind con Cheat Code Integrado.</w:t>
       </w:r>
     </w:p>
     <w:p>
-      <w:pPr>
-        <w:pStyle w:val="ListParagraph"/>
-        <w:numPr>
-          <w:ilvl w:val="2"/>
-          <w:numId w:val="1"/>
-        </w:numPr>
-      </w:pPr>
       <w:r>
-        <w:t>Red</w:t>
+        <w:t xml:space="preserve"/>
       </w:r>
     </w:p>
     <w:p>
-      <w:pPr>
-        <w:pStyle w:val="ListParagraph"/>
-        <w:numPr>
-          <w:ilvl w:val="2"/>
-          <w:numId w:val="1"/>
-        </w:numPr>
-      </w:pPr>
       <w:r>
-        <w:t>Brown</w:t>
+        <w:t xml:space="preserve">Fecha: 10-10-2026.</w:t>
       </w:r>
     </w:p>
     <w:p>
-      <w:pPr>
-        <w:pStyle w:val="ListParagraph"/>
-        <w:numPr>
-          <w:ilvl w:val="2"/>
-          <w:numId w:val="1"/>
-        </w:numPr>
-      </w:pPr>
       <w:r>
-        <w:t>N</w:t>
-      </w:r>
-      <w:r>
-        <w:t xml:space="preserve"> – </w:t>
-      </w:r>
-      <w:r>
-        <w:t>Green</w:t>
+        <w:t xml:space="preserve"/>
       </w:r>
     </w:p>
     <w:p>
-      <w:pPr>
-        <w:pStyle w:val="ListParagraph"/>
-        <w:numPr>
-          <w:ilvl w:val="1"/>
-          <w:numId w:val="1"/>
-        </w:numPr>
-      </w:pPr>
       <w:r>
-        <w:t>Tamaño válido (4, 6)</w:t>
+        <w:t xml:space="preserve">## Cumplimiento de requisitos</w:t>
       </w:r>
     </w:p>
     <w:p>
-      <w:pPr>
-        <w:pStyle w:val="ListParagraph"/>
-        <w:numPr>
-          <w:ilvl w:val="1"/>
-          <w:numId w:val="1"/>
-        </w:numPr>
-      </w:pPr>
       <w:r>
-        <w:t xml:space="preserve">Cheat code </w:t>
+        <w:t xml:space="preserve"/>
       </w:r>
     </w:p>
     <w:p>
-      <w:pPr>
-        <w:pStyle w:val="ListParagraph"/>
-        <w:numPr>
-          <w:ilvl w:val="0"/>
-          <w:numId w:val="1"/>
-        </w:numPr>
-      </w:pPr>
       <w:r>
-        <w:t>Configuración dinámica de colores</w:t>
-      </w:r>
-      <w:r>
-        <w:br/>
+        <w:t xml:space="preserve">Se implementaron el conteo de coincidencias exactas y colores fuera de posición sin doble conteo; validaciones de entradas nulas, tamaño 4 o 6, igualdad de tamaños y colores permitidos; logging con fecha; colores configurables por JSON; parámetro opcional de cheat; validación de código y disponibilidad; un uso por partida; selección aleatoria de posición y consumo del cheat incluso cuando la posición ya estaba acertada.</w:t>
       </w:r>
     </w:p>
     <w:p>
-      <w:pPr>
-        <w:rPr>
-          <w:lang w:val="es-CR"/>
-        </w:rPr>
-      </w:pPr>
       <w:r>
-        <w:rPr>
-          <w:lang w:val="es-CR"/>
-        </w:rPr>
-        <w:t>CHEAT CODE INTEGRADO</w:t>
-      </w:r>
-      <w:r>
-        <w:rPr>
-          <w:lang w:val="es-CR"/>
-        </w:rPr>
-        <w:br/>
-      </w:r>
-      <w:r>
-        <w:rPr>
-          <w:lang w:val="es-CR"/>
-        </w:rPr>
-        <w:t>- Parámetro opcional en EvaluarIntento</w:t>
-      </w:r>
-      <w:r>
-        <w:rPr>
-          <w:lang w:val="es-CR"/>
-        </w:rPr>
-        <w:br/>
-      </w:r>
-      <w:r>
-        <w:rPr>
-          <w:lang w:val="es-CR"/>
-        </w:rPr>
-        <w:t xml:space="preserve">- </w:t>
-      </w:r>
-      <w:r>
-        <w:rPr>
-          <w:lang w:val="es-CR"/>
-        </w:rPr>
-        <w:t>Só</w:t>
-      </w:r>
-      <w:r>
-        <w:rPr>
-          <w:lang w:val="es-CR"/>
-        </w:rPr>
-        <w:t>lo un uso por partida</w:t>
-      </w:r>
-      <w:r>
-        <w:rPr>
-          <w:lang w:val="es-CR"/>
-        </w:rPr>
-        <w:br/>
-      </w:r>
-      <w:r>
-        <w:rPr>
-          <w:lang w:val="es-CR"/>
-        </w:rPr>
-        <w:t>- Selecciona posición aleatoria</w:t>
-      </w:r>
-      <w:r>
-        <w:rPr>
-          <w:lang w:val="es-CR"/>
-        </w:rPr>
-        <w:br/>
-      </w:r>
-      <w:r>
-        <w:rPr>
-          <w:lang w:val="es-CR"/>
-        </w:rPr>
-        <w:t>- Si ya estaba acertada → 'sin suerte'</w:t>
-      </w:r>
-      <w:r>
-        <w:rPr>
-          <w:lang w:val="es-CR"/>
-        </w:rPr>
-        <w:br/>
-      </w:r>
-      <w:r>
-        <w:rPr>
-          <w:lang w:val="es-CR"/>
-        </w:rPr>
-        <w:t>- Siempre se consume</w:t>
+        <w:t xml:space="preserve"/>
       </w:r>
     </w:p>
     <w:p>
-      <w:pPr>
-        <w:spacing w:line="300" w:lineRule="auto"/>
-      </w:pPr>
       <w:r>
-        <w:rPr>
-          <w:rFonts w:ascii="Segoe UI" w:hAnsi="Segoe UI" w:eastAsia="Segoe UI" w:cs="Segoe UI"/>
-          <w:sz w:val="21"/>
-          <w:szCs w:val="21"/>
-        </w:rPr>
-        <w:t xml:space="preserve">EvaluarIntento(string patronSecreto, string intentoJugador, </w:t>
-      </w:r>
-      <w:r>
-        <w:rPr>
-          <w:rFonts w:ascii="Segoe UI" w:hAnsi="Segoe UI" w:eastAsia="Segoe UI" w:cs="Segoe UI"/>
-          <w:sz w:val="21"/>
-          <w:szCs w:val="21"/>
-        </w:rPr>
-        <w:t>string? cheatCode = null )</w:t>
+        <w:t xml:space="preserve">La aplicación de consola genera patrones aleatorios, permite intentos sucesivos y registra las evaluaciones en archivo. Se usa una instancia del evaluador por partida. La disponibilidad de códigos se carga al comenzar una partida; no se guarda un inventario global. El enunciado no define un esquema JSON obligatorio ni persistencia entre partidas, por lo que estas decisiones se documentan en README.md.</w:t>
       </w:r>
     </w:p>
     <w:p>
-      <w:pPr>
-        <w:rPr>
-          <w:lang w:val="es-CR"/>
-        </w:rPr>
-      </w:pPr>
       <w:r>
-        <w:rPr>
-          <w:lang w:val="es-ES"/>
-        </w:rPr>
-        <w:t>ARCHIVO JSON DE CHEAT CODES</w:t>
-      </w:r>
-      <w:r>
-        <w:rPr>
-          <w:lang w:val="es-CR"/>
-        </w:rPr>
-        <w:br/>
-      </w:r>
-      <w:r>
-        <w:rPr>
-          <w:lang w:val="es-ES"/>
-        </w:rPr>
-        <w:t>Ejemplo:</w:t>
-      </w:r>
-      <w:r>
-        <w:rPr>
-          <w:lang w:val="es-CR"/>
-        </w:rPr>
-        <w:br/>
-      </w:r>
-      <w:r>
-        <w:rPr>
-          <w:noProof/>
-        </w:rPr>
-        <w:drawing>
-          <wp:inline distT="0" distB="0" distL="0" distR="0" wp14:anchorId="4E4507E9" wp14:editId="775A30C5">
-            <wp:extent cx="5486400" cy="2228850"/>
-            <wp:effectExtent l="0" t="0" r="0" b="0"/>
-            <wp:docPr id="463792681" name="drawing"/>
-            <wp:cNvGraphicFramePr>
-              <a:graphicFrameLocks xmlns:a="http://schemas.openxmlformats.org/drawingml/2006/main" noChangeAspect="1"/>
-            </wp:cNvGraphicFramePr>
-            <a:graphic xmlns:a="http://schemas.openxmlformats.org/drawingml/2006/main">
-              <a:graphicData uri="http://schemas.openxmlformats.org/drawingml/2006/picture">
-                <pic:pic xmlns:pic="http://schemas.openxmlformats.org/drawingml/2006/picture">
-                  <pic:nvPicPr>
-                    <pic:cNvPr id="463792681" name="Picture 463792681"/>
-                    <pic:cNvPicPr/>
-                  </pic:nvPicPr>
-                  <pic:blipFill>
-                    <a:blip r:embed="rId8">
-                      <a:extLst>
-                        <a:ext uri="{28A0092B-C50C-407E-A947-70E740481C1C}">
-                          <a14:useLocalDpi xmlns:a14="http://schemas.microsoft.com/office/drawing/2010/main"/>
-                        </a:ext>
-                      </a:extLst>
-                    </a:blip>
-                    <a:stretch>
-                      <a:fillRect/>
-                    </a:stretch>
-                  </pic:blipFill>
-                  <pic:spPr>
-                    <a:xfrm>
-                      <a:off x="0" y="0"/>
-                      <a:ext cx="5486400" cy="2228850"/>
-                    </a:xfrm>
-                    <a:prstGeom prst="rect">
-                      <a:avLst/>
-                    </a:prstGeom>
-                  </pic:spPr>
-                </pic:pic>
-              </a:graphicData>
-            </a:graphic>
-          </wp:inline>
-        </w:drawing>
+        <w:t xml:space="preserve"/>
       </w:r>
     </w:p>
     <w:p>
-      <w:pPr>
-        <w:rPr>
-          <w:lang w:val="es-ES"/>
-        </w:rPr>
-      </w:pPr>
       <w:r>
-        <w:rPr>
-          <w:lang w:val="es-ES"/>
-        </w:rPr>
-        <w:t>Uso: validar si el cheat code enviado existe en esta lista</w:t>
-      </w:r>
-      <w:r>
-        <w:rPr>
-          <w:lang w:val="es-ES"/>
-        </w:rPr>
-        <w:t>; si tiene intentos disponibles y si ya ha sido usado en la sesión</w:t>
-      </w:r>
-      <w:r>
-        <w:rPr>
-          <w:lang w:val="es-CR"/>
-        </w:rPr>
-        <w:br/>
+        <w:t xml:space="preserve">Requisitos técnicos parcialmente realizados: ninguno identificado. Apartados personales pendientes: nombre, reflexión del estudiante y transcripción completa de la conversación. Este informe no inventa esos datos.</w:t>
       </w:r>
     </w:p>
     <w:p>
-      <w:pPr>
-        <w:rPr>
-          <w:lang w:val="es-ES"/>
-        </w:rPr>
-      </w:pPr>
       <w:r>
-        <w:rPr>
-          <w:lang w:val="es-ES"/>
-        </w:rPr>
-        <w:t>PRUEBAS UNITARIAS</w:t>
-      </w:r>
-      <w:r>
-        <w:rPr>
-          <w:lang w:val="es-CR"/>
-        </w:rPr>
-        <w:br/>
-      </w:r>
-      <w:r>
-        <w:rPr>
-          <w:lang w:val="es-ES"/>
-        </w:rPr>
-        <w:t>- Coincidencia completa</w:t>
-      </w:r>
-      <w:r>
-        <w:rPr>
-          <w:lang w:val="es-CR"/>
-        </w:rPr>
-        <w:br/>
-      </w:r>
-      <w:r>
-        <w:rPr>
-          <w:lang w:val="es-ES"/>
-        </w:rPr>
-        <w:t>- Coincidencia parcial</w:t>
-      </w:r>
-      <w:r>
-        <w:rPr>
-          <w:lang w:val="es-CR"/>
-        </w:rPr>
-        <w:br/>
-      </w:r>
-      <w:r>
-        <w:rPr>
-          <w:lang w:val="es-ES"/>
-        </w:rPr>
-        <w:t>- Ninguna coincidencia</w:t>
-      </w:r>
-      <w:r>
-        <w:rPr>
-          <w:lang w:val="es-CR"/>
-        </w:rPr>
-        <w:br/>
-      </w:r>
-      <w:r>
-        <w:rPr>
-          <w:lang w:val="es-ES"/>
-        </w:rPr>
-        <w:t>- Manejo de duplicados</w:t>
-      </w:r>
-      <w:r>
-        <w:rPr>
-          <w:lang w:val="es-ES"/>
-        </w:rPr>
-        <w:t xml:space="preserve"> – para uso de letras</w:t>
-      </w:r>
-      <w:r>
-        <w:rPr>
-          <w:lang w:val="es-CR"/>
-        </w:rPr>
-        <w:br/>
-      </w:r>
-      <w:r>
-        <w:rPr>
-          <w:lang w:val="es-ES"/>
-        </w:rPr>
-        <w:t>- Validaciones</w:t>
-      </w:r>
-      <w:r>
-        <w:rPr>
-          <w:lang w:val="es-CR"/>
-        </w:rPr>
-        <w:br/>
-      </w:r>
-      <w:r>
-        <w:rPr>
-          <w:lang w:val="es-ES"/>
-        </w:rPr>
-        <w:t>- Cheat válido</w:t>
-      </w:r>
-      <w:r>
-        <w:rPr>
-          <w:lang w:val="es-CR"/>
-        </w:rPr>
-        <w:br/>
-      </w:r>
-      <w:r>
-        <w:rPr>
-          <w:lang w:val="es-ES"/>
-        </w:rPr>
-        <w:t>- Cheat repetido</w:t>
-      </w:r>
-      <w:r>
-        <w:rPr>
-          <w:lang w:val="es-CR"/>
-        </w:rPr>
-        <w:br/>
-      </w:r>
-      <w:r>
-        <w:rPr>
-          <w:lang w:val="es-ES"/>
-        </w:rPr>
-        <w:t>- Cheat inútil</w:t>
-      </w:r>
-      <w:r>
-        <w:rPr>
-          <w:lang w:val="es-CR"/>
-        </w:rPr>
-        <w:br/>
+        <w:t xml:space="preserve"/>
       </w:r>
     </w:p>
     <w:p>
-      <w:pPr>
-        <w:pStyle w:val="Heading1"/>
-        <w:spacing w:before="280" w:after="80"/>
-        <w:jc w:val="center"/>
-        <w:rPr>
-          <w:rFonts w:ascii="Arial" w:hAnsi="Arial" w:eastAsia="Arial" w:cs="Arial"/>
-          <w:lang w:val="en-GB"/>
-        </w:rPr>
-      </w:pPr>
       <w:r>
-        <w:rPr>
-          <w:rFonts w:ascii="Arial" w:hAnsi="Arial" w:eastAsia="Arial" w:cs="Arial"/>
-        </w:rPr>
-        <w:t>Desarrollo del Trabajo en Clase</w:t>
+        <w:t xml:space="preserve">## Dificultades y soluciones</w:t>
       </w:r>
     </w:p>
     <w:p>
-      <w:pPr>
-        <w:pStyle w:val="Heading2"/>
-        <w:numPr>
-          <w:ilvl w:val="0"/>
-          <w:numId w:val="19"/>
-        </w:numPr>
-        <w:spacing w:before="280" w:after="80"/>
-        <w:jc w:val="both"/>
-        <w:rPr>
-          <w:rFonts w:ascii="Arial" w:hAnsi="Arial" w:eastAsia="Arial" w:cs="Arial"/>
-          <w:sz w:val="28"/>
-          <w:szCs w:val="28"/>
-          <w:lang w:val="es-CR"/>
-        </w:rPr>
-      </w:pPr>
       <w:r>
-        <w:rPr>
-          <w:rFonts w:ascii="Arial" w:hAnsi="Arial" w:eastAsia="Arial" w:cs="Arial"/>
-          <w:sz w:val="28"/>
-          <w:szCs w:val="28"/>
-          <w:lang w:val="es-CR"/>
-        </w:rPr>
-        <w:t>Conversación con el Agente de Visual Studio Code</w:t>
+        <w:t xml:space="preserve"/>
       </w:r>
     </w:p>
     <w:p>
-      <w:pPr>
-        <w:spacing w:after="120"/>
-        <w:jc w:val="both"/>
-        <w:rPr>
-          <w:rFonts w:ascii="Arial" w:hAnsi="Arial" w:eastAsia="Arial" w:cs="Arial"/>
-          <w:color w:val="000000" w:themeColor="text1"/>
-          <w:lang w:val="es-CR"/>
-        </w:rPr>
-      </w:pPr>
       <w:r>
-        <w:rPr>
-          <w:rFonts w:ascii="Arial" w:hAnsi="Arial" w:eastAsia="Arial" w:cs="Arial"/>
-          <w:color w:val="000000" w:themeColor="text1"/>
-          <w:lang w:val="es-CR"/>
-        </w:rPr>
-        <w:t>Pega aquí toda la conversación mantenida con el agente (GitHub Copilot o similar), incluyendo las preguntas, respuestas y sugerencias relevantes para el desarrollo del proyecto.</w:t>
+        <w:t xml:space="preserve">El repositorio inicialmente solo contenía .gitignore. Se creó una solución con biblioteca, consola y proyecto de pruebas. El equipo tenía runtime pero carecía de SDK; se instaló .NET SDK 10.0.401 en el perfil del usuario para compilar y ejecutar pruebas.</w:t>
       </w:r>
     </w:p>
     <w:p>
-      <w:pPr>
-        <w:spacing w:after="120"/>
-        <w:jc w:val="both"/>
-        <w:rPr>
-          <w:rFonts w:ascii="Arial" w:hAnsi="Arial" w:eastAsia="Arial" w:cs="Arial"/>
-          <w:color w:val="000000" w:themeColor="text1"/>
-          <w:lang w:val="es-CR"/>
-        </w:rPr>
-      </w:pPr>
       <w:r>
-        <w:rPr>
-          <w:rFonts w:ascii="Arial" w:hAnsi="Arial" w:eastAsia="Arial" w:cs="Arial"/>
-          <w:color w:val="000000" w:themeColor="text1"/>
-          <w:lang w:val="es-CR"/>
-        </w:rPr>
-        <w:t xml:space="preserve"> </w:t>
+        <w:t xml:space="preserve"/>
       </w:r>
     </w:p>
     <w:p>
-      <w:pPr>
-        <w:spacing w:after="120"/>
-        <w:jc w:val="both"/>
-        <w:rPr>
-          <w:rFonts w:ascii="Arial" w:hAnsi="Arial" w:eastAsia="Arial" w:cs="Arial"/>
-          <w:color w:val="000000" w:themeColor="text1"/>
-          <w:lang w:val="es-CR"/>
-        </w:rPr>
-      </w:pPr>
       <w:r>
-        <w:rPr>
-          <w:rFonts w:ascii="Arial" w:hAnsi="Arial" w:eastAsia="Arial" w:cs="Arial"/>
-          <w:color w:val="000000" w:themeColor="text1"/>
-          <w:lang w:val="es-CR"/>
-        </w:rPr>
-        <w:t xml:space="preserve"> </w:t>
+        <w:t xml:space="preserve">Para evitar doble conteo se excluyen primero las coincidencias exactas y después se consumen frecuencias de los colores restantes. Para verificar el azar y las fechas sin pruebas inestables se inyectan un selector de posición y un reloj. La compilación detectó un nombre local que ocultaba el campo de colores; se corrigió calificando el campo explícitamente.</w:t>
       </w:r>
     </w:p>
     <w:p>
-      <w:pPr>
-        <w:pStyle w:val="Heading2"/>
-        <w:numPr>
-          <w:ilvl w:val="0"/>
-          <w:numId w:val="19"/>
-        </w:numPr>
-        <w:spacing w:before="280" w:after="80"/>
-        <w:ind w:left="426"/>
-        <w:jc w:val="both"/>
-        <w:rPr>
-          <w:rFonts w:ascii="Arial" w:hAnsi="Arial" w:eastAsia="Arial" w:cs="Arial"/>
-          <w:sz w:val="28"/>
-          <w:szCs w:val="28"/>
-          <w:lang w:val="en-GB"/>
-        </w:rPr>
-      </w:pPr>
       <w:r>
-        <w:rPr>
-          <w:rFonts w:ascii="Arial" w:hAnsi="Arial" w:eastAsia="Arial" w:cs="Arial"/>
-          <w:sz w:val="28"/>
-          <w:szCs w:val="28"/>
-        </w:rPr>
-        <w:t>Análisis de Resultados</w:t>
+        <w:t xml:space="preserve"/>
       </w:r>
     </w:p>
     <w:p>
-      <w:pPr>
-        <w:pStyle w:val="Heading2"/>
-        <w:numPr>
-          <w:ilvl w:val="1"/>
-          <w:numId w:val="19"/>
-        </w:numPr>
-        <w:spacing w:before="280" w:after="80"/>
-        <w:jc w:val="both"/>
-        <w:rPr>
-          <w:rFonts w:ascii="Arial" w:hAnsi="Arial" w:eastAsia="Arial" w:cs="Arial"/>
-          <w:sz w:val="28"/>
-          <w:szCs w:val="28"/>
-          <w:lang w:val="en-GB"/>
-        </w:rPr>
-      </w:pPr>
       <w:r>
-        <w:rPr>
-          <w:rFonts w:ascii="Arial" w:hAnsi="Arial" w:eastAsia="Arial" w:cs="Arial"/>
-          <w:sz w:val="28"/>
-          <w:szCs w:val="28"/>
-        </w:rPr>
-        <w:t>Cumplimiento de requisitos</w:t>
+        <w:t xml:space="preserve">## Flujo de Git y evidencia</w:t>
       </w:r>
     </w:p>
     <w:p>
-      <w:pPr>
-        <w:pStyle w:val="ListParagraph"/>
-        <w:numPr>
-          <w:ilvl w:val="0"/>
-          <w:numId w:val="18"/>
-        </w:numPr>
-        <w:spacing w:after="0"/>
-        <w:jc w:val="both"/>
-        <w:rPr>
-          <w:rFonts w:ascii="Arial" w:hAnsi="Arial" w:eastAsia="Arial" w:cs="Arial"/>
-          <w:color w:val="000000" w:themeColor="text1"/>
-          <w:lang w:val="es-CR"/>
-        </w:rPr>
-      </w:pPr>
       <w:r>
-        <w:rPr>
-          <w:rFonts w:ascii="Arial" w:hAnsi="Arial" w:eastAsia="Arial" w:cs="Arial"/>
-          <w:color w:val="000000" w:themeColor="text1"/>
-          <w:lang w:val="es-CR"/>
-        </w:rPr>
-        <w:t>¿Qué requisitos se cumplieron completamente?</w:t>
+        <w:t xml:space="preserve"/>
       </w:r>
     </w:p>
     <w:p>
-      <w:pPr>
-        <w:spacing w:after="120"/>
-        <w:jc w:val="both"/>
-        <w:rPr>
-          <w:rFonts w:ascii="Arial" w:hAnsi="Arial" w:eastAsia="Arial" w:cs="Arial"/>
-          <w:color w:val="000000" w:themeColor="text1"/>
-          <w:lang w:val="es-CR"/>
-        </w:rPr>
-      </w:pPr>
       <w:r>
-        <w:rPr>
-          <w:rFonts w:ascii="Arial" w:hAnsi="Arial" w:eastAsia="Arial" w:cs="Arial"/>
-          <w:color w:val="000000" w:themeColor="text1"/>
-          <w:lang w:val="es-CR"/>
-        </w:rPr>
-        <w:t xml:space="preserve"> </w:t>
+        <w:t xml:space="preserve">Se clonó el repositorio y se trabajó en main. No se crearon ramas adicionales ni pull requests. Los cambios se organizaron en las cuatro etapas indicadas: algoritmo básico, pruebas básicas, requisitos avanzados y ampliación de pruebas. La documentación se agregó en un commit separado. El listado verificable de commits está en docs/commits.txt.</w:t>
       </w:r>
     </w:p>
     <w:p>
-      <w:pPr>
-        <w:spacing w:after="120"/>
-        <w:jc w:val="both"/>
-        <w:rPr>
-          <w:rFonts w:ascii="Arial" w:hAnsi="Arial" w:eastAsia="Arial" w:cs="Arial"/>
-          <w:color w:val="000000" w:themeColor="text1"/>
-          <w:lang w:val="es-CR"/>
-        </w:rPr>
-      </w:pPr>
       <w:r>
-        <w:rPr>
-          <w:rFonts w:ascii="Arial" w:hAnsi="Arial" w:eastAsia="Arial" w:cs="Arial"/>
-          <w:color w:val="000000" w:themeColor="text1"/>
-          <w:lang w:val="es-CR"/>
-        </w:rPr>
-        <w:t xml:space="preserve"> </w:t>
+        <w:t xml:space="preserve"/>
       </w:r>
     </w:p>
     <w:p>
-      <w:pPr>
-        <w:pStyle w:val="ListParagraph"/>
-        <w:numPr>
-          <w:ilvl w:val="0"/>
-          <w:numId w:val="17"/>
-        </w:numPr>
-        <w:spacing w:after="0"/>
-        <w:jc w:val="both"/>
-        <w:rPr>
-          <w:rFonts w:ascii="Arial" w:hAnsi="Arial" w:eastAsia="Arial" w:cs="Arial"/>
-          <w:color w:val="000000" w:themeColor="text1"/>
-          <w:lang w:val="es-CR"/>
-        </w:rPr>
-      </w:pPr>
       <w:r>
-        <w:rPr>
-          <w:rFonts w:ascii="Arial" w:hAnsi="Arial" w:eastAsia="Arial" w:cs="Arial"/>
-          <w:color w:val="000000" w:themeColor="text1"/>
-          <w:lang w:val="es-CR"/>
-        </w:rPr>
-        <w:t>¿Qué requisitos se cumplieron parcialmente?</w:t>
+        <w:t xml:space="preserve">## Código fuente y pruebas</w:t>
       </w:r>
     </w:p>
     <w:p>
-      <w:pPr>
-        <w:spacing w:after="120"/>
-        <w:jc w:val="both"/>
-        <w:rPr>
-          <w:rFonts w:ascii="Arial" w:hAnsi="Arial" w:eastAsia="Arial" w:cs="Arial"/>
-          <w:color w:val="000000" w:themeColor="text1"/>
-          <w:lang w:val="es-CR"/>
-        </w:rPr>
-      </w:pPr>
       <w:r>
-        <w:rPr>
-          <w:rFonts w:ascii="Arial" w:hAnsi="Arial" w:eastAsia="Arial" w:cs="Arial"/>
-          <w:color w:val="000000" w:themeColor="text1"/>
-          <w:lang w:val="es-CR"/>
-        </w:rPr>
-        <w:t xml:space="preserve"> </w:t>
+        <w:t xml:space="preserve"/>
       </w:r>
     </w:p>
     <w:p>
-      <w:pPr>
-        <w:spacing w:after="120"/>
-        <w:jc w:val="both"/>
-        <w:rPr>
-          <w:rFonts w:ascii="Arial" w:hAnsi="Arial" w:eastAsia="Arial" w:cs="Arial"/>
-          <w:color w:val="000000" w:themeColor="text1"/>
-          <w:lang w:val="es-CR"/>
-        </w:rPr>
-      </w:pPr>
       <w:r>
-        <w:rPr>
-          <w:rFonts w:ascii="Arial" w:hAnsi="Arial" w:eastAsia="Arial" w:cs="Arial"/>
-          <w:color w:val="000000" w:themeColor="text1"/>
-          <w:lang w:val="es-CR"/>
-        </w:rPr>
-        <w:t xml:space="preserve"> </w:t>
+        <w:t xml:space="preserve">src/Mastermind.Core contiene el evaluador y el cargador de configuración. src/Mastermind.Console contiene el juego y su JSON. tests/Mastermind.Tests contiene las pruebas xUnit. README.md explica ejecución y reglas.</w:t>
       </w:r>
     </w:p>
     <w:p>
-      <w:pPr>
-        <w:pStyle w:val="ListParagraph"/>
-        <w:numPr>
-          <w:ilvl w:val="0"/>
-          <w:numId w:val="16"/>
-        </w:numPr>
-        <w:spacing w:after="0"/>
-        <w:jc w:val="both"/>
-        <w:rPr>
-          <w:rFonts w:ascii="Arial" w:hAnsi="Arial" w:eastAsia="Arial" w:cs="Arial"/>
-          <w:color w:val="000000" w:themeColor="text1"/>
-          <w:lang w:val="es-CR"/>
-        </w:rPr>
-      </w:pPr>
       <w:r>
-        <w:rPr>
-          <w:rFonts w:ascii="Arial" w:hAnsi="Arial" w:eastAsia="Arial" w:cs="Arial"/>
-          <w:color w:val="000000" w:themeColor="text1"/>
-          <w:lang w:val="es-CR"/>
-        </w:rPr>
-        <w:t>¿Qué requisitos no se realizaron del todo?</w:t>
+        <w:t xml:space="preserve"/>
       </w:r>
     </w:p>
     <w:p>
-      <w:pPr>
-        <w:spacing w:after="120"/>
-        <w:jc w:val="both"/>
-        <w:rPr>
-          <w:rFonts w:ascii="Arial" w:hAnsi="Arial" w:eastAsia="Arial" w:cs="Arial"/>
-          <w:color w:val="000000" w:themeColor="text1"/>
-          <w:lang w:val="es-CR"/>
-        </w:rPr>
-      </w:pPr>
       <w:r>
-        <w:rPr>
-          <w:rFonts w:ascii="Arial" w:hAnsi="Arial" w:eastAsia="Arial" w:cs="Arial"/>
-          <w:color w:val="000000" w:themeColor="text1"/>
-          <w:lang w:val="es-CR"/>
-        </w:rPr>
-        <w:t xml:space="preserve"> </w:t>
+        <w:t xml:space="preserve">Verificación: 24 pruebas aprobadas, 0 fallidas y 0 omitidas. Compilación Release con 0 advertencias y 0 errores. La salida real de dotnet test está en docs/pruebas.txt. Se ejecutó también la consola con entradas inválidas, código desconocido, pista válida y segundo uso rechazado.</w:t>
       </w:r>
     </w:p>
     <w:p>
-      <w:pPr>
-        <w:spacing w:after="120"/>
-        <w:jc w:val="both"/>
-        <w:rPr>
-          <w:rFonts w:ascii="Arial" w:hAnsi="Arial" w:eastAsia="Arial" w:cs="Arial"/>
-          <w:color w:val="000000" w:themeColor="text1"/>
-          <w:lang w:val="es-CR"/>
-        </w:rPr>
-      </w:pPr>
       <w:r>
-        <w:rPr>
-          <w:rFonts w:ascii="Arial" w:hAnsi="Arial" w:eastAsia="Arial" w:cs="Arial"/>
-          <w:color w:val="000000" w:themeColor="text1"/>
-          <w:lang w:val="es-CR"/>
-        </w:rPr>
-        <w:t xml:space="preserve"> </w:t>
+        <w:t xml:space="preserve"/>
       </w:r>
     </w:p>
     <w:p>
-      <w:pPr>
-        <w:pStyle w:val="Heading2"/>
-        <w:numPr>
-          <w:ilvl w:val="1"/>
-          <w:numId w:val="19"/>
-        </w:numPr>
-        <w:spacing w:before="280" w:after="80"/>
-        <w:jc w:val="both"/>
-        <w:rPr>
-          <w:rFonts w:ascii="Arial" w:hAnsi="Arial" w:eastAsia="Arial" w:cs="Arial"/>
-          <w:sz w:val="28"/>
-          <w:szCs w:val="28"/>
-          <w:lang w:val="en-GB"/>
-        </w:rPr>
-      </w:pPr>
       <w:r>
-        <w:rPr>
-          <w:rFonts w:ascii="Arial" w:hAnsi="Arial" w:eastAsia="Arial" w:cs="Arial"/>
-          <w:sz w:val="28"/>
-          <w:szCs w:val="28"/>
-        </w:rPr>
-        <w:t>Dificultades encontradas</w:t>
+        <w:t xml:space="preserve">La retrocompatibilidad se verifica conservando sin cambios las seis pruebas básicas y la llamada EvaluarIntento con dos argumentos. La ampliación agrega la pista como propiedad opcional sin alterar el conteo original para entradas válidas.</w:t>
       </w:r>
     </w:p>
     <w:p>
-      <w:pPr>
-        <w:pStyle w:val="ListParagraph"/>
-        <w:numPr>
-          <w:ilvl w:val="0"/>
-          <w:numId w:val="3"/>
-        </w:numPr>
-        <w:spacing w:after="0"/>
-        <w:jc w:val="both"/>
-        <w:rPr>
-          <w:rFonts w:ascii="Arial" w:hAnsi="Arial" w:eastAsia="Arial" w:cs="Arial"/>
-          <w:color w:val="000000" w:themeColor="text1"/>
-          <w:lang w:val="es-CR"/>
-        </w:rPr>
-      </w:pPr>
       <w:r>
-        <w:rPr>
-          <w:rFonts w:ascii="Arial" w:hAnsi="Arial" w:eastAsia="Arial" w:cs="Arial"/>
-          <w:color w:val="000000" w:themeColor="text1"/>
-          <w:lang w:val="es-CR"/>
-        </w:rPr>
-        <w:t>Describe brevemente los principales retos o dificultades técnicas y cómo se r</w:t>
-      </w:r>
-      <w:r>
-        <w:rPr>
-          <w:rFonts w:ascii="Arial" w:hAnsi="Arial" w:eastAsia="Arial" w:cs="Arial"/>
-          <w:color w:val="000000" w:themeColor="text1"/>
-          <w:lang w:val="es-CR"/>
-        </w:rPr>
-        <w:t>es</w:t>
-      </w:r>
-      <w:r>
-        <w:rPr>
-          <w:rFonts w:ascii="Arial" w:hAnsi="Arial" w:eastAsia="Arial" w:cs="Arial"/>
-          <w:color w:val="000000" w:themeColor="text1"/>
-          <w:lang w:val="es-CR"/>
-        </w:rPr>
-        <w:t>olvieron, si aplica</w:t>
+        <w:t xml:space="preserve"/>
       </w:r>
     </w:p>
     <w:p>
-      <w:pPr>
-        <w:spacing w:after="120"/>
-        <w:jc w:val="both"/>
-        <w:rPr>
-          <w:rFonts w:ascii="Arial" w:hAnsi="Arial" w:eastAsia="Arial" w:cs="Arial"/>
-          <w:color w:val="000000" w:themeColor="text1"/>
-          <w:lang w:val="es-CR"/>
-        </w:rPr>
-      </w:pPr>
       <w:r>
-        <w:rPr>
-          <w:rFonts w:ascii="Arial" w:hAnsi="Arial" w:eastAsia="Arial" w:cs="Arial"/>
-          <w:color w:val="000000" w:themeColor="text1"/>
-          <w:lang w:val="es-CR"/>
-        </w:rPr>
-        <w:t xml:space="preserve"> </w:t>
+        <w:t xml:space="preserve">## Conversación con el agente</w:t>
       </w:r>
     </w:p>
     <w:p>
-      <w:pPr>
-        <w:pStyle w:val="Heading2"/>
-        <w:numPr>
-          <w:ilvl w:val="0"/>
-          <w:numId w:val="19"/>
-        </w:numPr>
-        <w:spacing w:before="280" w:after="80"/>
-        <w:ind w:left="426"/>
-        <w:jc w:val="both"/>
-        <w:rPr>
-          <w:rFonts w:ascii="Arial" w:hAnsi="Arial" w:eastAsia="Arial" w:cs="Arial"/>
-          <w:sz w:val="28"/>
-          <w:szCs w:val="28"/>
-          <w:lang w:val="es-CR"/>
-        </w:rPr>
-      </w:pPr>
       <w:r>
-        <w:rPr>
-          <w:rFonts w:ascii="Arial" w:hAnsi="Arial" w:eastAsia="Arial" w:cs="Arial"/>
-          <w:sz w:val="28"/>
-          <w:szCs w:val="28"/>
-          <w:lang w:val="es-CR"/>
-        </w:rPr>
-        <w:t>Evidencia de commits y flujo de trabajo en GitHub</w:t>
+        <w:t xml:space="preserve"/>
       </w:r>
     </w:p>
     <w:p>
-      <w:pPr>
-        <w:pStyle w:val="ListParagraph"/>
-        <w:numPr>
-          <w:ilvl w:val="0"/>
-          <w:numId w:val="12"/>
-        </w:numPr>
-        <w:spacing w:after="0"/>
-        <w:jc w:val="both"/>
-        <w:rPr>
-          <w:rFonts w:ascii="Arial" w:hAnsi="Arial" w:eastAsia="Arial" w:cs="Arial"/>
-          <w:color w:val="000000" w:themeColor="text1"/>
-          <w:lang w:val="es-CR"/>
-        </w:rPr>
-      </w:pPr>
       <w:r>
-        <w:rPr>
-          <w:rFonts w:ascii="Arial" w:hAnsi="Arial" w:eastAsia="Arial" w:cs="Arial"/>
-          <w:color w:val="000000" w:themeColor="text1"/>
-          <w:lang w:val="es-CR"/>
-        </w:rPr>
-        <w:t>Capturas de pantalla o listado de los principales commits realizados.</w:t>
+        <w:t xml:space="preserve">Solicitud disponible del estudiante: “Look, I'd like us to do this task i put you a file with the instructions, the project folder would be D:\temp\git\Mastermind, and the repository URL would be: https://github.com/AndrewShot01/Mastermind.git”.</w:t>
       </w:r>
     </w:p>
     <w:p>
-      <w:pPr>
-        <w:spacing w:after="120"/>
-        <w:jc w:val="both"/>
-        <w:rPr>
-          <w:rFonts w:ascii="Arial" w:hAnsi="Arial" w:eastAsia="Arial" w:cs="Arial"/>
-          <w:color w:val="000000" w:themeColor="text1"/>
-          <w:lang w:val="es-CR"/>
-        </w:rPr>
-      </w:pPr>
       <w:r>
-        <w:rPr>
-          <w:rFonts w:ascii="Arial" w:hAnsi="Arial" w:eastAsia="Arial" w:cs="Arial"/>
-          <w:color w:val="000000" w:themeColor="text1"/>
-          <w:lang w:val="es-CR"/>
-        </w:rPr>
-        <w:t xml:space="preserve"> </w:t>
+        <w:t xml:space="preserve"/>
       </w:r>
     </w:p>
     <w:p>
-      <w:pPr>
-        <w:spacing w:after="120"/>
-        <w:jc w:val="both"/>
-        <w:rPr>
-          <w:rFonts w:ascii="Arial" w:hAnsi="Arial" w:eastAsia="Arial" w:cs="Arial"/>
-          <w:color w:val="000000" w:themeColor="text1"/>
-          <w:lang w:val="es-CR"/>
-        </w:rPr>
-      </w:pPr>
       <w:r>
-        <w:rPr>
-          <w:rFonts w:ascii="Arial" w:hAnsi="Arial" w:eastAsia="Arial" w:cs="Arial"/>
-          <w:color w:val="000000" w:themeColor="text1"/>
-          <w:lang w:val="es-CR"/>
-        </w:rPr>
-        <w:t xml:space="preserve"> </w:t>
+        <w:t xml:space="preserve">El agente leyó el documento, inspeccionó y clonó el repositorio, explicó las decisiones sobre pistas y configuración, implementó el código y ejecutó las verificaciones descritas. Esto es un resumen, no una transcripción íntegra. PENDIENTE: pegar o exportar toda la conversación desde el chat al preparar la entrega.</w:t>
       </w:r>
     </w:p>
     <w:p>
-      <w:pPr>
-        <w:pStyle w:val="ListParagraph"/>
-        <w:numPr>
-          <w:ilvl w:val="0"/>
-          <w:numId w:val="11"/>
-        </w:numPr>
-        <w:spacing w:after="0"/>
-        <w:jc w:val="both"/>
-        <w:rPr>
-          <w:rFonts w:ascii="Arial" w:hAnsi="Arial" w:eastAsia="Arial" w:cs="Arial"/>
-          <w:color w:val="000000" w:themeColor="text1"/>
-          <w:lang w:val="es-CR"/>
-        </w:rPr>
-      </w:pPr>
       <w:r>
-        <w:rPr>
-          <w:rFonts w:ascii="Arial" w:hAnsi="Arial" w:eastAsia="Arial" w:cs="Arial"/>
-          <w:color w:val="000000" w:themeColor="text1"/>
-          <w:lang w:val="es-CR"/>
-        </w:rPr>
-        <w:t>Breve explicación del flujo de trabajo seguido (ramas, pull requests, fusiones, etc.)</w:t>
+        <w:t xml:space="preserve"/>
       </w:r>
     </w:p>
     <w:p>
-      <w:pPr>
-        <w:spacing w:after="120"/>
-        <w:jc w:val="both"/>
-        <w:rPr>
-          <w:rFonts w:ascii="Arial" w:hAnsi="Arial" w:eastAsia="Arial" w:cs="Arial"/>
-          <w:color w:val="000000" w:themeColor="text1"/>
-          <w:lang w:val="es-CR"/>
-        </w:rPr>
-      </w:pPr>
       <w:r>
-        <w:rPr>
-          <w:rFonts w:ascii="Arial" w:hAnsi="Arial" w:eastAsia="Arial" w:cs="Arial"/>
-          <w:color w:val="000000" w:themeColor="text1"/>
-          <w:lang w:val="es-CR"/>
-        </w:rPr>
-        <w:t xml:space="preserve"> </w:t>
+        <w:t xml:space="preserve">## Conclusiones y recomendaciones</w:t>
       </w:r>
     </w:p>
     <w:p>
-      <w:pPr>
-        <w:spacing w:after="120"/>
-        <w:jc w:val="both"/>
-        <w:rPr>
-          <w:rFonts w:ascii="Arial" w:hAnsi="Arial" w:eastAsia="Arial" w:cs="Arial"/>
-          <w:color w:val="000000" w:themeColor="text1"/>
-          <w:lang w:val="es-CR"/>
-        </w:rPr>
-      </w:pPr>
       <w:r>
-        <w:rPr>
-          <w:rFonts w:ascii="Arial" w:hAnsi="Arial" w:eastAsia="Arial" w:cs="Arial"/>
-          <w:color w:val="000000" w:themeColor="text1"/>
-          <w:lang w:val="es-CR"/>
-        </w:rPr>
-        <w:t xml:space="preserve"> </w:t>
+        <w:t xml:space="preserve"/>
       </w:r>
     </w:p>
     <w:p>
-      <w:pPr>
-        <w:pStyle w:val="Heading2"/>
-        <w:numPr>
-          <w:ilvl w:val="0"/>
-          <w:numId w:val="19"/>
-        </w:numPr>
-        <w:spacing w:before="280" w:after="80"/>
-        <w:ind w:left="426"/>
-        <w:jc w:val="both"/>
-        <w:rPr>
-          <w:rFonts w:ascii="Arial" w:hAnsi="Arial" w:eastAsia="Arial" w:cs="Arial"/>
-          <w:sz w:val="28"/>
-          <w:szCs w:val="28"/>
-          <w:lang w:val="en-GB"/>
-        </w:rPr>
-      </w:pPr>
       <w:r>
-        <w:rPr>
-          <w:rFonts w:ascii="Arial" w:hAnsi="Arial" w:eastAsia="Arial" w:cs="Arial"/>
-          <w:sz w:val="28"/>
-          <w:szCs w:val="28"/>
-        </w:rPr>
-        <w:t>Código fuente y pruebas unitarias</w:t>
+        <w:t xml:space="preserve">El ejercicio demuestra cómo separar el algoritmo, el estado de una partida y la interacción de consola. Las pruebas de duplicados y del consumo de cheats comprueban casos que un ejemplo de coincidencia completa no cubre. Para ampliar el proyecto se puede agregar una interfaz gráfica y decidir explícitamente si los usos deben persistir entre partidas.</w:t>
       </w:r>
     </w:p>
     <w:p>
-      <w:pPr>
-        <w:pStyle w:val="ListParagraph"/>
-        <w:numPr>
-          <w:ilvl w:val="0"/>
-          <w:numId w:val="9"/>
-        </w:numPr>
-        <w:spacing w:after="0"/>
-        <w:jc w:val="both"/>
-        <w:rPr>
-          <w:rFonts w:ascii="Arial" w:hAnsi="Arial" w:eastAsia="Arial" w:cs="Arial"/>
-          <w:color w:val="000000" w:themeColor="text1"/>
-          <w:lang w:val="es-CR"/>
-        </w:rPr>
-      </w:pPr>
       <w:r>
-        <w:rPr>
-          <w:rFonts w:ascii="Arial" w:hAnsi="Arial" w:eastAsia="Arial" w:cs="Arial"/>
-          <w:color w:val="000000" w:themeColor="text1"/>
-          <w:lang w:val="es-CR"/>
-        </w:rPr>
-        <w:t>Breve descripción de la estructura del proyecto.</w:t>
+        <w:t xml:space="preserve"/>
       </w:r>
     </w:p>
     <w:p>
-      <w:pPr>
-        <w:spacing w:after="120"/>
-        <w:jc w:val="both"/>
-        <w:rPr>
-          <w:rFonts w:ascii="Arial" w:hAnsi="Arial" w:eastAsia="Arial" w:cs="Arial"/>
-          <w:color w:val="000000" w:themeColor="text1"/>
-          <w:lang w:val="es-CR"/>
-        </w:rPr>
-      </w:pPr>
       <w:r>
-        <w:rPr>
-          <w:rFonts w:ascii="Arial" w:hAnsi="Arial" w:eastAsia="Arial" w:cs="Arial"/>
-          <w:color w:val="000000" w:themeColor="text1"/>
-          <w:lang w:val="es-CR"/>
-        </w:rPr>
-        <w:t xml:space="preserve"> </w:t>
+        <w:t xml:space="preserve">PENDIENTE: reflexión personal del estudiante sobre el aprendizaje obtenido.</w:t>
       </w:r>
     </w:p>
-    <w:p>
-      <w:pPr>
-        <w:spacing w:after="120"/>
-        <w:jc w:val="both"/>
-        <w:rPr>
-          <w:rFonts w:ascii="Arial" w:hAnsi="Arial" w:eastAsia="Arial" w:cs="Arial"/>
-          <w:color w:val="000000" w:themeColor="text1"/>
-          <w:lang w:val="es-CR"/>
-        </w:rPr>
-      </w:pPr>
-      <w:r>
-        <w:rPr>
-          <w:rFonts w:ascii="Arial" w:hAnsi="Arial" w:eastAsia="Arial" w:cs="Arial"/>
-          <w:color w:val="000000" w:themeColor="text1"/>
-          <w:lang w:val="es-CR"/>
-        </w:rPr>
-        <w:t xml:space="preserve"> </w:t>
-      </w:r>
-    </w:p>
-    <w:p>
-      <w:pPr>
-        <w:pStyle w:val="ListParagraph"/>
-        <w:numPr>
-          <w:ilvl w:val="0"/>
-          <w:numId w:val="8"/>
-        </w:numPr>
-        <w:spacing w:after="0"/>
-        <w:jc w:val="both"/>
-        <w:rPr>
-          <w:rFonts w:ascii="Arial" w:hAnsi="Arial" w:eastAsia="Arial" w:cs="Arial"/>
-          <w:color w:val="000000" w:themeColor="text1"/>
-          <w:lang w:val="es-CR"/>
-        </w:rPr>
-      </w:pPr>
-      <w:r>
-        <w:rPr>
-          <w:rFonts w:ascii="Arial" w:hAnsi="Arial" w:eastAsia="Arial" w:cs="Arial"/>
-          <w:color w:val="000000" w:themeColor="text1"/>
-          <w:lang w:val="es-CR"/>
-        </w:rPr>
-        <w:t>Fragmentos relevantes del código fuente (opcional, solo si se desea resaltar algo).</w:t>
-      </w:r>
-    </w:p>
-    <w:p>
-      <w:pPr>
-        <w:spacing w:after="120"/>
-        <w:ind w:left="720"/>
-        <w:rPr>
-          <w:rFonts w:ascii="Arial" w:hAnsi="Arial" w:eastAsia="Arial" w:cs="Arial"/>
-          <w:color w:val="000000" w:themeColor="text1"/>
-          <w:lang w:val="es-CR"/>
-        </w:rPr>
-      </w:pPr>
-      <w:r>
-        <w:rPr>
-          <w:rFonts w:ascii="Arial" w:hAnsi="Arial" w:eastAsia="Arial" w:cs="Arial"/>
-          <w:color w:val="000000" w:themeColor="text1"/>
-          <w:lang w:val="es-CR"/>
-        </w:rPr>
-        <w:t xml:space="preserve"> </w:t>
-      </w:r>
-    </w:p>
-    <w:p>
-      <w:pPr>
-        <w:spacing w:after="120"/>
-        <w:jc w:val="both"/>
-        <w:rPr>
-          <w:rFonts w:ascii="Arial" w:hAnsi="Arial" w:eastAsia="Arial" w:cs="Arial"/>
-          <w:color w:val="000000" w:themeColor="text1"/>
-          <w:lang w:val="es-CR"/>
-        </w:rPr>
-      </w:pPr>
-      <w:r>
-        <w:rPr>
-          <w:rFonts w:ascii="Arial" w:hAnsi="Arial" w:eastAsia="Arial" w:cs="Arial"/>
-          <w:color w:val="000000" w:themeColor="text1"/>
-          <w:lang w:val="es-CR"/>
-        </w:rPr>
-        <w:t xml:space="preserve"> </w:t>
-      </w:r>
-    </w:p>
-    <w:p>
-      <w:pPr>
-        <w:pStyle w:val="ListParagraph"/>
-        <w:numPr>
-          <w:ilvl w:val="0"/>
-          <w:numId w:val="7"/>
-        </w:numPr>
-        <w:spacing w:after="0"/>
-        <w:jc w:val="both"/>
-        <w:rPr>
-          <w:rFonts w:ascii="Arial" w:hAnsi="Arial" w:eastAsia="Arial" w:cs="Arial"/>
-          <w:color w:val="000000" w:themeColor="text1"/>
-          <w:lang w:val="es-CR"/>
-        </w:rPr>
-      </w:pPr>
-      <w:r>
-        <w:rPr>
-          <w:rFonts w:ascii="Arial" w:hAnsi="Arial" w:eastAsia="Arial" w:cs="Arial"/>
-          <w:color w:val="000000" w:themeColor="text1"/>
-          <w:lang w:val="es-CR"/>
-        </w:rPr>
-        <w:t>Evidencia de las pruebas unitarias (resultados de ejecución, capturas de pantalla, etc.).</w:t>
-      </w:r>
-    </w:p>
-    <w:p>
-      <w:pPr>
-        <w:spacing w:after="120"/>
-        <w:jc w:val="both"/>
-        <w:rPr>
-          <w:rFonts w:ascii="Arial" w:hAnsi="Arial" w:eastAsia="Arial" w:cs="Arial"/>
-          <w:color w:val="000000" w:themeColor="text1"/>
-          <w:lang w:val="es-CR"/>
-        </w:rPr>
-      </w:pPr>
-      <w:r>
-        <w:rPr>
-          <w:rFonts w:ascii="Arial" w:hAnsi="Arial" w:eastAsia="Arial" w:cs="Arial"/>
-          <w:color w:val="000000" w:themeColor="text1"/>
-          <w:lang w:val="es-CR"/>
-        </w:rPr>
-        <w:t xml:space="preserve"> </w:t>
-      </w:r>
-    </w:p>
-    <w:p>
-      <w:pPr>
-        <w:spacing w:after="120"/>
-        <w:jc w:val="both"/>
-        <w:rPr>
-          <w:rFonts w:ascii="Arial" w:hAnsi="Arial" w:eastAsia="Arial" w:cs="Arial"/>
-          <w:color w:val="000000" w:themeColor="text1"/>
-          <w:lang w:val="es-CR"/>
-        </w:rPr>
-      </w:pPr>
-      <w:r>
-        <w:rPr>
-          <w:rFonts w:ascii="Arial" w:hAnsi="Arial" w:eastAsia="Arial" w:cs="Arial"/>
-          <w:color w:val="000000" w:themeColor="text1"/>
-          <w:lang w:val="es-CR"/>
-        </w:rPr>
-        <w:t xml:space="preserve"> </w:t>
-      </w:r>
-    </w:p>
-    <w:p>
-      <w:pPr>
-        <w:pStyle w:val="ListParagraph"/>
-        <w:numPr>
-          <w:ilvl w:val="0"/>
-          <w:numId w:val="6"/>
-        </w:numPr>
-        <w:spacing w:after="0"/>
-        <w:jc w:val="both"/>
-        <w:rPr>
-          <w:rFonts w:ascii="Arial" w:hAnsi="Arial" w:eastAsia="Arial" w:cs="Arial"/>
-          <w:color w:val="000000" w:themeColor="text1"/>
-          <w:lang w:val="es-CR"/>
-        </w:rPr>
-      </w:pPr>
-      <w:r>
-        <w:rPr>
-          <w:rFonts w:ascii="Arial" w:hAnsi="Arial" w:eastAsia="Arial" w:cs="Arial"/>
-          <w:color w:val="000000" w:themeColor="text1"/>
-          <w:lang w:val="es-CR"/>
-        </w:rPr>
-        <w:t>Explicación de cómo se garantiza la retrocompatibilidad de las pruebas.</w:t>
-      </w:r>
-    </w:p>
-    <w:p>
-      <w:pPr>
-        <w:spacing w:after="120"/>
-        <w:jc w:val="both"/>
-        <w:rPr>
-          <w:rFonts w:ascii="Arial" w:hAnsi="Arial" w:eastAsia="Arial" w:cs="Arial"/>
-          <w:color w:val="000000" w:themeColor="text1"/>
-          <w:lang w:val="es-CR"/>
-        </w:rPr>
-      </w:pPr>
-      <w:r>
-        <w:rPr>
-          <w:rFonts w:ascii="Arial" w:hAnsi="Arial" w:eastAsia="Arial" w:cs="Arial"/>
-          <w:color w:val="000000" w:themeColor="text1"/>
-          <w:lang w:val="es-CR"/>
-        </w:rPr>
-        <w:t xml:space="preserve"> </w:t>
-      </w:r>
-    </w:p>
-    <w:p>
-      <w:pPr>
-        <w:spacing w:after="120"/>
-        <w:jc w:val="both"/>
-        <w:rPr>
-          <w:rFonts w:ascii="Arial" w:hAnsi="Arial" w:eastAsia="Arial" w:cs="Arial"/>
-          <w:color w:val="000000" w:themeColor="text1"/>
-          <w:lang w:val="es-CR"/>
-        </w:rPr>
-      </w:pPr>
-      <w:r>
-        <w:rPr>
-          <w:rFonts w:ascii="Arial" w:hAnsi="Arial" w:eastAsia="Arial" w:cs="Arial"/>
-          <w:color w:val="000000" w:themeColor="text1"/>
-          <w:lang w:val="es-CR"/>
-        </w:rPr>
-        <w:t xml:space="preserve"> </w:t>
-      </w:r>
-    </w:p>
-    <w:p>
-      <w:pPr>
-        <w:pStyle w:val="Heading2"/>
-        <w:numPr>
-          <w:ilvl w:val="0"/>
-          <w:numId w:val="19"/>
-        </w:numPr>
-        <w:spacing w:before="280" w:after="80"/>
-        <w:ind w:left="426"/>
-        <w:jc w:val="both"/>
-        <w:rPr>
-          <w:rFonts w:ascii="Arial" w:hAnsi="Arial" w:eastAsia="Arial" w:cs="Arial"/>
-          <w:sz w:val="28"/>
-          <w:szCs w:val="28"/>
-          <w:lang w:val="en-GB"/>
-        </w:rPr>
-      </w:pPr>
-      <w:r>
-        <w:rPr>
-          <w:rFonts w:ascii="Arial" w:hAnsi="Arial" w:eastAsia="Arial" w:cs="Arial"/>
-          <w:sz w:val="28"/>
-          <w:szCs w:val="28"/>
-        </w:rPr>
-        <w:t>Conclusiones y recomendaciones</w:t>
-      </w:r>
-    </w:p>
-    <w:p>
-      <w:pPr>
-        <w:pStyle w:val="ListParagraph"/>
-        <w:numPr>
-          <w:ilvl w:val="0"/>
-          <w:numId w:val="4"/>
-        </w:numPr>
-        <w:spacing w:after="0"/>
-        <w:jc w:val="both"/>
-        <w:rPr>
-          <w:rFonts w:ascii="Arial" w:hAnsi="Arial" w:eastAsia="Arial" w:cs="Arial"/>
-          <w:color w:val="000000" w:themeColor="text1"/>
-          <w:lang w:val="es-CR"/>
-        </w:rPr>
-      </w:pPr>
-      <w:r>
-        <w:rPr>
-          <w:rFonts w:ascii="Arial" w:hAnsi="Arial" w:eastAsia="Arial" w:cs="Arial"/>
-          <w:color w:val="000000" w:themeColor="text1"/>
-          <w:lang w:val="es-CR"/>
-        </w:rPr>
-        <w:t>Reflexión personal sobre el aprendizaje obtenido y sugerencias para mejorar el ejercicio.</w:t>
-      </w:r>
-    </w:p>
-    <w:p>
-      <w:pPr>
-        <w:spacing w:after="120"/>
-        <w:jc w:val="both"/>
-        <w:rPr>
-          <w:rFonts w:ascii="Arial" w:hAnsi="Arial" w:eastAsia="Arial" w:cs="Arial"/>
-          <w:color w:val="000000" w:themeColor="text1"/>
-          <w:lang w:val="es-CR"/>
-        </w:rPr>
-      </w:pPr>
-      <w:r>
-        <w:rPr>
-          <w:rFonts w:ascii="Arial" w:hAnsi="Arial" w:eastAsia="Arial" w:cs="Arial"/>
-          <w:color w:val="000000" w:themeColor="text1"/>
-          <w:lang w:val="es-CR"/>
-        </w:rPr>
-        <w:t xml:space="preserve"> </w:t>
-      </w:r>
-    </w:p>
-    <w:p>
-      <w:pPr>
-        <w:spacing w:after="120"/>
-        <w:jc w:val="both"/>
-        <w:rPr>
-          <w:rFonts w:ascii="Arial" w:hAnsi="Arial" w:eastAsia="Arial" w:cs="Arial"/>
-          <w:color w:val="000000" w:themeColor="text1"/>
-          <w:lang w:val="es-CR"/>
-        </w:rPr>
-      </w:pPr>
-    </w:p>
-    <w:p>
-      <w:pPr>
-        <w:rPr>
-          <w:rFonts w:ascii="Cambria" w:hAnsi="Cambria" w:eastAsia="Cambria" w:cs="Cambria"/>
-          <w:color w:val="000000" w:themeColor="text1"/>
-          <w:lang w:val="es-CR"/>
-        </w:rPr>
-      </w:pPr>
-    </w:p>
-    <w:p>
-      <w:pPr>
-        <w:rPr>
-          <w:lang w:val="es-CR"/>
-        </w:rPr>
-      </w:pPr>
-    </w:p>
-    <w:p>
-      <w:pPr>
-        <w:rPr>
-          <w:lang w:val="es-CR"/>
-        </w:rPr>
-      </w:pPr>
-    </w:p>
     <w:sectPr>
-      <w:footerReference w:type="even" r:id="rId9"/>
-      <w:footerReference w:type="default" r:id="rId10"/>
-      <w:footerReference w:type="first" r:id="rId11"/>
-      <w:pgSz w:w="12240" w:h="15840" w:orient="portrait"/>
-      <w:pgMar w:top="1440" w:right="1800" w:bottom="1440" w:left="1800" w:header="720" w:footer="720" w:gutter="0"/>
-      <w:cols w:space="720"/>
-      <w:docGrid w:linePitch="360"/>
+      <w:pgSz w:w="12240" w:h="15840"/>
+      <w:pgMar w:top="1440" w:right="1440" w:bottom="1440" w:left="1440"/>
     </w:sectPr>
   </w:body>
 </w:document>

</xml_diff>